<commit_message>
Update tpt.docx convocation template
</commit_message>
<xml_diff>
--- a/convocations/tpt.docx
+++ b/convocations/tpt.docx
@@ -447,13 +447,13 @@
         <mc:AlternateContent>
           <mc:Choice Requires="wps">
             <w:drawing>
-              <wp:anchor distT="0" distB="0" distL="114300" distR="114300" simplePos="0" relativeHeight="251663360" behindDoc="0" locked="0" layoutInCell="1" allowOverlap="1" wp14:anchorId="7DD8E6C2" wp14:editId="240B0BFF">
+              <wp:anchor distT="0" distB="0" distL="114300" distR="114300" simplePos="0" relativeHeight="251663360" behindDoc="0" locked="0" layoutInCell="1" allowOverlap="1" wp14:anchorId="7DD8E6C2" wp14:editId="246CA8C2">
                 <wp:simplePos x="0" y="0"/>
                 <wp:positionH relativeFrom="column">
                   <wp:posOffset>685165</wp:posOffset>
                 </wp:positionH>
                 <wp:positionV relativeFrom="paragraph">
-                  <wp:posOffset>283210</wp:posOffset>
+                  <wp:posOffset>216535</wp:posOffset>
                 </wp:positionV>
                 <wp:extent cx="742950" cy="0"/>
                 <wp:effectExtent l="6350" t="6350" r="12700" b="12700"/>
@@ -508,7 +508,11 @@
           </mc:Choice>
           <mc:Fallback>
             <w:pict>
-              <v:shape w14:anchorId="1549F864" id="AutoShape 8" o:spid="_x0000_s1026" type="#_x0000_t32" style="position:absolute;margin-left:53.95pt;margin-top:22.3pt;width:58.5pt;height:0;z-index:251663360;visibility:visible;mso-wrap-style:square;mso-width-percent:0;mso-height-percent:0;mso-wrap-distance-left:9pt;mso-wrap-distance-top:0;mso-wrap-distance-right:9pt;mso-wrap-distance-bottom:0;mso-position-horizontal:absolute;mso-position-horizontal-relative:text;mso-position-vertical:absolute;mso-position-vertical-relative:text;mso-width-percent:0;mso-height-percent:0;mso-width-relative:page;mso-height-relative:page" o:gfxdata="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"/>
+              <v:shapetype w14:anchorId="6583D798" id="_x0000_t32" coordsize="21600,21600" o:spt="32" o:oned="t" path="m,l21600,21600e" filled="f">
+                <v:path arrowok="t" fillok="f" o:connecttype="none"/>
+                <o:lock v:ext="edit" shapetype="t"/>
+              </v:shapetype>
+              <v:shape id="AutoShape 8" o:spid="_x0000_s1026" type="#_x0000_t32" style="position:absolute;margin-left:53.95pt;margin-top:17.05pt;width:58.5pt;height:0;z-index:251663360;visibility:visible;mso-wrap-style:square;mso-width-percent:0;mso-height-percent:0;mso-wrap-distance-left:9pt;mso-wrap-distance-top:0;mso-wrap-distance-right:9pt;mso-wrap-distance-bottom:0;mso-position-horizontal:absolute;mso-position-horizontal-relative:text;mso-position-vertical:absolute;mso-position-vertical-relative:text;mso-width-percent:0;mso-height-percent:0;mso-width-relative:page;mso-height-relative:page" o:gfxdata="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"/>
             </w:pict>
           </mc:Fallback>
         </mc:AlternateContent>
@@ -1329,17 +1333,15 @@
           <w:rFonts w:ascii="Montserrat" w:hAnsi="Montserrat" w:cs="Times New Roman"/>
           <w:b/>
           <w:iCs/>
-          <w:color w:val="0000FF"/>
-          <w:sz w:val="18"/>
-          <w:szCs w:val="18"/>
-        </w:rPr>
-      </w:pPr>
-      <w:r>
-        <w:rPr>
-          <w:rFonts w:ascii="Montserrat" w:hAnsi="Montserrat" w:cs="Times New Roman"/>
-          <w:b/>
-          <w:iCs/>
-          <w:color w:val="0000FF"/>
+          <w:sz w:val="18"/>
+          <w:szCs w:val="18"/>
+        </w:rPr>
+      </w:pPr>
+      <w:r>
+        <w:rPr>
+          <w:rFonts w:ascii="Montserrat" w:hAnsi="Montserrat" w:cs="Times New Roman"/>
+          <w:b/>
+          <w:iCs/>
           <w:sz w:val="18"/>
           <w:szCs w:val="18"/>
         </w:rPr>
@@ -1350,7 +1352,6 @@
           <w:rFonts w:ascii="Montserrat" w:hAnsi="Montserrat" w:cs="Times New Roman"/>
           <w:b/>
           <w:iCs/>
-          <w:color w:val="0000FF"/>
           <w:sz w:val="18"/>
           <w:szCs w:val="18"/>
           <w:vertAlign w:val="superscript"/>
@@ -1362,7 +1363,6 @@
           <w:rFonts w:ascii="Montserrat" w:hAnsi="Montserrat" w:cs="Times New Roman"/>
           <w:b/>
           <w:iCs/>
-          <w:color w:val="0000FF"/>
           <w:sz w:val="18"/>
           <w:szCs w:val="18"/>
         </w:rPr>

</xml_diff>